<commit_message>
Add Power Platform Admin Baseline project page
</commit_message>
<xml_diff>
--- a/UbelioFernandezTabetResume.docx
+++ b/UbelioFernandezTabetResume.docx
@@ -96,13 +96,7 @@
         <w:rPr>
           <w:rFonts w:ascii="Times" w:hAnsi="Times" w:cs="Times"/>
         </w:rPr>
-        <w:t>Website:</w:t>
-      </w:r>
-      <w:r>
-        <w:rPr>
-          <w:rFonts w:ascii="Times" w:hAnsi="Times" w:cs="Times"/>
-        </w:rPr>
-        <w:t xml:space="preserve"> </w:t>
+        <w:t xml:space="preserve">Website: </w:t>
       </w:r>
       <w:hyperlink r:id="rId5" w:history="1">
         <w:r>
@@ -150,7 +144,7 @@
           <w:rFonts w:ascii="Times" w:hAnsi="Times" w:cs="Times"/>
           <w:sz w:val="22"/>
         </w:rPr>
-        <w:t>Strategic IT leader with 10+ years of experience driving secure, scalable solutions across manufacturing, education, and MSP sectors. Boosted Microsoft Secure Score from 30% to 87%, automated patching for 1,000+ endpoints, and saved $10K+ through cloud migration. Expert in Microsoft 365, Azure, Entra ID, Intune, Exchange, and SCCM. Specializes in identity management, endpoint security, automation, and Zero Trust architecture. Aligns IT strategy with business goals to reduce risk and maximize ROI.</w:t>
+        <w:t>Cloud Security and Automation Engineer with 10+ years of experience across financial services, manufacturing, education, and MSP environments. Migrated a legacy on-premises SIEM to Microsoft Sentinel while reducing operating cost by over 60%, and engineered 60+ detection rules across 14 connectors and three threat intelligence feeds. Raised Microsoft Secure Score from 30% to 87% at one organization and maintains 93% at another. Automates at scale with PowerShell, Power Automate, and Azure Logic Apps, reducing user and device provisioning from four hours to under one. Builds AI-powered Copilot Studio agents, including MCP-connected solutions. Specializes in identity governance, cloud security posture, detection engineering, and automation in regulated banking environments.</w:t>
       </w:r>
     </w:p>
     <w:p>
@@ -161,7 +155,7 @@
     </w:p>
     <w:p>
       <w:pPr>
-        <w:spacing w:after="120"/>
+        <w:spacing w:after="0"/>
         <w:ind w:right="360"/>
       </w:pPr>
       <w:r>
@@ -287,10 +281,14 @@
     </w:p>
     <w:p>
       <w:pPr>
+        <w:spacing w:after="0"/>
         <w:ind w:right="360"/>
       </w:pPr>
     </w:p>
     <w:p>
+      <w:pPr>
+        <w:spacing w:after="0"/>
+      </w:pPr>
       <w:r>
         <w:rPr>
           <w:rFonts w:ascii="Times" w:hAnsi="Times" w:cs="Times"/>
@@ -317,6 +315,320 @@
           <w:b/>
           <w:sz w:val="22"/>
         </w:rPr>
+        <w:t>Cloud Security and Automation Engineer</w:t>
+      </w:r>
+    </w:p>
+    <w:p>
+      <w:pPr>
+        <w:spacing w:after="0"/>
+      </w:pPr>
+      <w:r>
+        <w:rPr>
+          <w:rFonts w:ascii="Times" w:hAnsi="Times" w:cs="Times"/>
+          <w:b/>
+          <w:sz w:val="22"/>
+        </w:rPr>
+        <w:t>Bravera Holdings Corp – Nov 2025–Present</w:t>
+      </w:r>
+    </w:p>
+    <w:p>
+      <w:pPr>
+        <w:spacing w:after="0"/>
+      </w:pPr>
+      <w:r>
+        <w:rPr>
+          <w:rFonts w:ascii="Times" w:hAnsi="Times" w:cs="Times"/>
+          <w:sz w:val="22"/>
+        </w:rPr>
+        <w:t>-Migrated legacy on-premises SIEM to Microsoft Sentinel, reducing annual operating cost from $16-18K to $6K while significantly expanding detection coverage</w:t>
+      </w:r>
+    </w:p>
+    <w:p>
+      <w:pPr>
+        <w:spacing w:after="0"/>
+      </w:pPr>
+      <w:r>
+        <w:rPr>
+          <w:rFonts w:ascii="Times" w:hAnsi="Times" w:cs="Times"/>
+          <w:sz w:val="22"/>
+        </w:rPr>
+        <w:t>-Engineered 60+ Sentinel analytic rules spanning threat detection, identity protection, and break-glass account monitoring, with coverage continuing to expand as the platform matures</w:t>
+      </w:r>
+    </w:p>
+    <w:p>
+      <w:pPr>
+        <w:spacing w:after="0"/>
+      </w:pPr>
+      <w:r>
+        <w:rPr>
+          <w:rFonts w:ascii="Times" w:hAnsi="Times" w:cs="Times"/>
+          <w:sz w:val="22"/>
+        </w:rPr>
+        <w:t>-Integrated 14 log connectors including Cortex via Linux syslog and Mimecast via API, plus three threat intelligence feeds: FS-ISAC, Microsoft Defender, and AlienVault</w:t>
+      </w:r>
+    </w:p>
+    <w:p>
+      <w:pPr>
+        <w:spacing w:after="0"/>
+      </w:pPr>
+      <w:r>
+        <w:rPr>
+          <w:rFonts w:ascii="Times" w:hAnsi="Times" w:cs="Times"/>
+          <w:sz w:val="22"/>
+        </w:rPr>
+        <w:t>-Built meta-detections alerting on ingestion pipeline deterioration, ensuring monitoring gaps surface immediately rather than silently</w:t>
+      </w:r>
+    </w:p>
+    <w:p>
+      <w:pPr>
+        <w:spacing w:after="0"/>
+      </w:pPr>
+      <w:r>
+        <w:rPr>
+          <w:rFonts w:ascii="Times" w:hAnsi="Times" w:cs="Times"/>
+          <w:sz w:val="22"/>
+        </w:rPr>
+        <w:t>-Deployed Microsoft Defender for Cloud Apps discovery to identify and govern shadow IT across the organization</w:t>
+      </w:r>
+    </w:p>
+    <w:p>
+      <w:pPr>
+        <w:spacing w:after="0"/>
+      </w:pPr>
+      <w:r>
+        <w:rPr>
+          <w:rFonts w:ascii="Times" w:hAnsi="Times" w:cs="Times"/>
+          <w:sz w:val="22"/>
+        </w:rPr>
+        <w:t>-Developed tenant-wide phishing containment tooling with just-in-time privilege enforcement, mandatory preview, and full audit logging</w:t>
+      </w:r>
+    </w:p>
+    <w:p>
+      <w:pPr>
+        <w:spacing w:after="0"/>
+      </w:pPr>
+      <w:r>
+        <w:rPr>
+          <w:rFonts w:ascii="Times" w:hAnsi="Times" w:cs="Times"/>
+          <w:sz w:val="22"/>
+        </w:rPr>
+        <w:t>-Maintain Microsoft Secure Score at 93% through Defender for Cloud recommendations, Azure Policy, and Conditional Access hardening</w:t>
+      </w:r>
+    </w:p>
+    <w:p>
+      <w:pPr>
+        <w:spacing w:after="0"/>
+      </w:pPr>
+      <w:r>
+        <w:rPr>
+          <w:rFonts w:ascii="Times" w:hAnsi="Times" w:cs="Times"/>
+          <w:sz w:val="22"/>
+        </w:rPr>
+        <w:t>-Conducted Azure Well-Architected Assessment and Defender for Cloud regulatory compliance reviews aligned to banking and financial services requirements</w:t>
+      </w:r>
+    </w:p>
+    <w:p>
+      <w:pPr>
+        <w:spacing w:after="0"/>
+      </w:pPr>
+      <w:r>
+        <w:rPr>
+          <w:rFonts w:ascii="Times" w:hAnsi="Times" w:cs="Times"/>
+          <w:sz w:val="22"/>
+        </w:rPr>
+        <w:t>-Led Azure cleanup and cost auditing initiative, optimizing subscription spend across the environment</w:t>
+      </w:r>
+    </w:p>
+    <w:p>
+      <w:pPr>
+        <w:spacing w:after="0"/>
+      </w:pPr>
+      <w:r>
+        <w:rPr>
+          <w:rFonts w:ascii="Times" w:hAnsi="Times" w:cs="Times"/>
+          <w:sz w:val="22"/>
+        </w:rPr>
+        <w:lastRenderedPageBreak/>
+        <w:t>-Implemented Microsoft Purview sensitivity labels and retention policies supporting regulatory data governance obligations</w:t>
+      </w:r>
+    </w:p>
+    <w:p>
+      <w:pPr>
+        <w:spacing w:after="0"/>
+      </w:pPr>
+      <w:r>
+        <w:rPr>
+          <w:rFonts w:ascii="Times" w:hAnsi="Times" w:cs="Times"/>
+          <w:sz w:val="22"/>
+        </w:rPr>
+        <w:t>-Migrated and enrolled 610 devices into Intune for modern MDM and hybrid identity management across a 700-mailbox tenant</w:t>
+      </w:r>
+    </w:p>
+    <w:p>
+      <w:pPr>
+        <w:spacing w:after="0"/>
+      </w:pPr>
+      <w:r>
+        <w:rPr>
+          <w:rFonts w:ascii="Times" w:hAnsi="Times" w:cs="Times"/>
+          <w:sz w:val="22"/>
+        </w:rPr>
+        <w:t>-Deployed Windows Autopilot for hybrid-joined device provisioning, reducing PC setup time from 4 hours to 30-45 minutes</w:t>
+      </w:r>
+    </w:p>
+    <w:p>
+      <w:pPr>
+        <w:spacing w:after="0"/>
+      </w:pPr>
+      <w:r>
+        <w:rPr>
+          <w:rFonts w:ascii="Times" w:hAnsi="Times" w:cs="Times"/>
+          <w:sz w:val="22"/>
+        </w:rPr>
+        <w:t>-Automated HR-driven IT user provisioning, eliminating manual account creation and reducing onboarding turnaround from hours to minutes</w:t>
+      </w:r>
+    </w:p>
+    <w:p>
+      <w:pPr>
+        <w:spacing w:after="0"/>
+      </w:pPr>
+      <w:r>
+        <w:rPr>
+          <w:rFonts w:ascii="Times" w:hAnsi="Times" w:cs="Times"/>
+          <w:sz w:val="22"/>
+        </w:rPr>
+        <w:t>-Implemented protected actions with authentication contexts, PIM access reviews, restricted management administrative units, and passwordless authentication</w:t>
+      </w:r>
+    </w:p>
+    <w:p>
+      <w:pPr>
+        <w:spacing w:after="0"/>
+      </w:pPr>
+      <w:r>
+        <w:rPr>
+          <w:rFonts w:ascii="Times" w:hAnsi="Times" w:cs="Times"/>
+          <w:sz w:val="22"/>
+        </w:rPr>
+        <w:t>-Built SCIM provisioning bridges for Adobe and Zoom, automating license and identity lifecycle across third-party platforms</w:t>
+      </w:r>
+    </w:p>
+    <w:p>
+      <w:pPr>
+        <w:spacing w:after="0"/>
+      </w:pPr>
+      <w:r>
+        <w:rPr>
+          <w:rFonts w:ascii="Times" w:hAnsi="Times" w:cs="Times"/>
+          <w:sz w:val="22"/>
+        </w:rPr>
+        <w:t>-Led enterprise AI implementation, authoring governance policy and administrative guides for Copilot, AI retention, and agent administration</w:t>
+      </w:r>
+    </w:p>
+    <w:p>
+      <w:pPr>
+        <w:spacing w:after="0"/>
+      </w:pPr>
+      <w:r>
+        <w:rPr>
+          <w:rFonts w:ascii="Times" w:hAnsi="Times" w:cs="Times"/>
+          <w:sz w:val="22"/>
+        </w:rPr>
+        <w:t>-Led Power Platform implementation and established the admin baseline governing environments, connectors, and DLP policy</w:t>
+      </w:r>
+    </w:p>
+    <w:p>
+      <w:pPr>
+        <w:spacing w:after="0"/>
+        <w:rPr>
+          <w:rFonts w:ascii="Times" w:hAnsi="Times" w:cs="Times"/>
+          <w:sz w:val="22"/>
+        </w:rPr>
+      </w:pPr>
+      <w:r>
+        <w:rPr>
+          <w:rFonts w:ascii="Times" w:hAnsi="Times" w:cs="Times"/>
+          <w:sz w:val="22"/>
+        </w:rPr>
+        <w:t>-</w:t>
+      </w:r>
+      <w:r>
+        <w:rPr>
+          <w:rFonts w:ascii="Times" w:hAnsi="Times" w:cs="Times"/>
+          <w:sz w:val="22"/>
+        </w:rPr>
+        <w:t>Built and maintain 30+ production Power Automate flows and 19 Azure Logic Apps automating HR onboarding, change management request routing and ITSM ticket creation, fraud intake reporting, and recurring compliance reporting, eliminating approximately 200 hours of manual work annually</w:t>
+      </w:r>
+    </w:p>
+    <w:p>
+      <w:pPr>
+        <w:spacing w:after="0"/>
+      </w:pPr>
+      <w:r>
+        <w:rPr>
+          <w:rFonts w:ascii="Times" w:hAnsi="Times" w:cs="Times"/>
+          <w:sz w:val="22"/>
+        </w:rPr>
+        <w:t>-Developed Copilot Studio agents including an MCP-connected Microsoft documentation assistant and a business research agent producing structured preparation artifacts</w:t>
+      </w:r>
+    </w:p>
+    <w:p>
+      <w:pPr>
+        <w:spacing w:after="0"/>
+      </w:pPr>
+      <w:r>
+        <w:rPr>
+          <w:rFonts w:ascii="Times" w:hAnsi="Times" w:cs="Times"/>
+          <w:sz w:val="22"/>
+        </w:rPr>
+        <w:t>-Engineered PowerShell automation for Entra device lifecycle management, mailbox quota enforcement, and biweekly permission audit reporting supporting external audit requirements</w:t>
+      </w:r>
+    </w:p>
+    <w:p>
+      <w:pPr>
+        <w:spacing w:after="0"/>
+      </w:pPr>
+      <w:r>
+        <w:rPr>
+          <w:rFonts w:ascii="Times" w:hAnsi="Times" w:cs="Times"/>
+          <w:sz w:val="22"/>
+        </w:rPr>
+        <w:t>-Trained junior systems administrators on Microsoft Entra, Defender, and incident response procedures using Defender XDR</w:t>
+      </w:r>
+    </w:p>
+    <w:p>
+      <w:pPr>
+        <w:spacing w:after="0"/>
+      </w:pPr>
+      <w:r>
+        <w:rPr>
+          <w:rFonts w:ascii="Times" w:hAnsi="Times" w:cs="Times"/>
+          <w:sz w:val="22"/>
+        </w:rPr>
+        <w:t>-Authored governance policy and operational guides for AI, Power Platform, and SharePoint, and updated existing M365, Entra, and Copilot governance</w:t>
+      </w:r>
+    </w:p>
+    <w:p>
+      <w:pPr>
+        <w:spacing w:after="0"/>
+      </w:pPr>
+      <w:r>
+        <w:rPr>
+          <w:rFonts w:ascii="Times" w:hAnsi="Times" w:cs="Times"/>
+          <w:sz w:val="22"/>
+        </w:rPr>
+        <w:t xml:space="preserve"> </w:t>
+      </w:r>
+    </w:p>
+    <w:p>
+      <w:pPr>
+        <w:spacing w:after="0"/>
+      </w:pPr>
+      <w:r>
+        <w:rPr>
+          <w:rFonts w:ascii="Times" w:hAnsi="Times" w:cs="Times"/>
+          <w:b/>
+          <w:sz w:val="22"/>
+        </w:rPr>
         <w:t xml:space="preserve">Senior IT Systems Administrator </w:t>
       </w:r>
     </w:p>
@@ -330,15 +642,7 @@
           <w:b/>
           <w:sz w:val="22"/>
         </w:rPr>
-        <w:t>Douglas Machine Inc – Alexandria, MN | Nov 2023–</w:t>
-      </w:r>
-      <w:r>
-        <w:rPr>
-          <w:rFonts w:ascii="Times" w:hAnsi="Times" w:cs="Times"/>
-          <w:b/>
-          <w:sz w:val="22"/>
-        </w:rPr>
-        <w:t>October 2025</w:t>
+        <w:t>Douglas Machine Inc – Alexandria, MN | Nov 2023–October 2025</w:t>
       </w:r>
     </w:p>
     <w:p>
@@ -458,31 +762,31 @@
           <w:rFonts w:ascii="Times" w:hAnsi="Times" w:cs="Times"/>
           <w:sz w:val="22"/>
         </w:rPr>
+        <w:t xml:space="preserve">-Supported virtualization and infrastructure upgrades using VMware and deployed thin clients via Dell Wyse Management Suite </w:t>
+      </w:r>
+    </w:p>
+    <w:p>
+      <w:pPr>
+        <w:spacing w:after="0"/>
+      </w:pPr>
+      <w:r>
+        <w:rPr>
+          <w:rFonts w:ascii="Times" w:hAnsi="Times" w:cs="Times"/>
+          <w:sz w:val="22"/>
+        </w:rPr>
+        <w:t xml:space="preserve">-Deployed Windows Hello in a hybrid environment to enhance on-premises authentication security and reduce password reliance </w:t>
+      </w:r>
+    </w:p>
+    <w:p>
+      <w:pPr>
+        <w:spacing w:after="0"/>
+      </w:pPr>
+      <w:r>
+        <w:rPr>
+          <w:rFonts w:ascii="Times" w:hAnsi="Times" w:cs="Times"/>
+          <w:sz w:val="22"/>
+        </w:rPr>
         <w:lastRenderedPageBreak/>
-        <w:t xml:space="preserve">-Supported virtualization and infrastructure upgrades using VMware and deployed thin clients via Dell Wyse Management Suite </w:t>
-      </w:r>
-    </w:p>
-    <w:p>
-      <w:pPr>
-        <w:spacing w:after="0"/>
-      </w:pPr>
-      <w:r>
-        <w:rPr>
-          <w:rFonts w:ascii="Times" w:hAnsi="Times" w:cs="Times"/>
-          <w:sz w:val="22"/>
-        </w:rPr>
-        <w:t xml:space="preserve">-Deployed Windows Hello in a hybrid environment to enhance on-premises authentication security and reduce password reliance </w:t>
-      </w:r>
-    </w:p>
-    <w:p>
-      <w:pPr>
-        <w:spacing w:after="0"/>
-      </w:pPr>
-      <w:r>
-        <w:rPr>
-          <w:rFonts w:ascii="Times" w:hAnsi="Times" w:cs="Times"/>
-          <w:sz w:val="22"/>
-        </w:rPr>
         <w:t xml:space="preserve">-Led upgrade and migration initiatives from Windows 10 to 11 and Windows Server 2016/2019 to 2022/2025, automating prerequisite checks and streamlining deployment </w:t>
       </w:r>
     </w:p>
@@ -767,7 +1071,7 @@
           <w:sz w:val="22"/>
         </w:rPr>
         <w:br/>
-        <w:t>-Installed, configured, and supported classroom and event AV systems including projectors, soundboards, and display technologies.</w:t>
+        <w:t>-Administered core infrastructure including Active Directory (AD), domain controllers (DCs), print servers, and server room hardware; ensured uptime and coordinated with external teams during outages.</w:t>
       </w:r>
       <w:r>
         <w:rPr>
@@ -775,30 +1079,7 @@
           <w:sz w:val="22"/>
         </w:rPr>
         <w:br/>
-        <w:t>-Administered c</w:t>
-      </w:r>
-      <w:r>
-        <w:rPr>
-          <w:rFonts w:ascii="Times" w:hAnsi="Times" w:cs="Times"/>
-          <w:sz w:val="22"/>
-        </w:rPr>
-        <w:t>ore infrastructure including Active Directory (AD), domain controllers (DCs), print servers, and server room hardware; ensured uptime and coordinated with external teams during outages.</w:t>
-      </w:r>
-      <w:r>
-        <w:rPr>
-          <w:rFonts w:ascii="Times" w:hAnsi="Times" w:cs="Times"/>
-          <w:sz w:val="22"/>
-        </w:rPr>
-        <w:br/>
-        <w:t xml:space="preserve">-Managed Microsoft 365 licensing, user account provisioning, password lifecycle, access levels, and email setup for </w:t>
-      </w:r>
-      <w:r>
-        <w:rPr>
-          <w:rFonts w:ascii="Times" w:hAnsi="Times" w:cs="Times"/>
-          <w:sz w:val="22"/>
-        </w:rPr>
-        <w:lastRenderedPageBreak/>
-        <w:t>all school staff.</w:t>
+        <w:t>-Managed Microsoft 365 licensing, user account provisioning, password lifecycle, access levels, and email setup for all school staff.</w:t>
       </w:r>
       <w:r>
         <w:rPr>
@@ -814,21 +1095,6 @@
           <w:sz w:val="22"/>
         </w:rPr>
         <w:br/>
-        <w:t>-Maintained Excel-based asset inventory for all technology equipment, tracking life</w:t>
-      </w:r>
-      <w:r>
-        <w:rPr>
-          <w:rFonts w:ascii="Times" w:hAnsi="Times" w:cs="Times"/>
-          <w:sz w:val="22"/>
-        </w:rPr>
-        <w:t>cycle status and usage across the school.</w:t>
-      </w:r>
-      <w:r>
-        <w:rPr>
-          <w:rFonts w:ascii="Times" w:hAnsi="Times" w:cs="Times"/>
-          <w:sz w:val="22"/>
-        </w:rPr>
-        <w:br/>
         <w:t>-Delivered Tier 1–2 technical support for staff and students, resolving hardware/software issues and maintaining operational continuity.</w:t>
       </w:r>
       <w:r>
@@ -843,106 +1109,6 @@
     <w:p>
       <w:pPr>
         <w:spacing w:after="0"/>
-      </w:pPr>
-      <w:r>
-        <w:rPr>
-          <w:rFonts w:ascii="Times" w:hAnsi="Times" w:cs="Times"/>
-          <w:sz w:val="22"/>
-        </w:rPr>
-        <w:t xml:space="preserve">-Led full-scale smartboard integration across classrooms, replacing legacy systems and training staff on interactive instructional use. </w:t>
-      </w:r>
-    </w:p>
-    <w:p>
-      <w:pPr>
-        <w:spacing w:after="0"/>
-      </w:pPr>
-      <w:r>
-        <w:rPr>
-          <w:rFonts w:ascii="Times" w:hAnsi="Times" w:cs="Times"/>
-          <w:sz w:val="22"/>
-        </w:rPr>
-        <w:t xml:space="preserve">-Directed lifecycle replacement of classroom projectors and deployed new PCs for faculty and administrative staff, improving performance and reliability. -Spearheaded rollout of student devices, including Chromebooks (managed via Google Admin Console) and iPads (provisioned through Apple Configurator 2), ensuring secure, scalable access to digital learning tools. </w:t>
-      </w:r>
-    </w:p>
-    <w:p>
-      <w:pPr>
-        <w:spacing w:after="0"/>
-      </w:pPr>
-      <w:r>
-        <w:rPr>
-          <w:rFonts w:ascii="Times" w:hAnsi="Times" w:cs="Times"/>
-          <w:sz w:val="22"/>
-        </w:rPr>
-        <w:t xml:space="preserve">-Installed, configured, and supported classroom and event AV systems including projectors, soundboards, and display technologies. </w:t>
-      </w:r>
-    </w:p>
-    <w:p>
-      <w:pPr>
-        <w:spacing w:after="0"/>
-      </w:pPr>
-      <w:r>
-        <w:rPr>
-          <w:rFonts w:ascii="Times" w:hAnsi="Times" w:cs="Times"/>
-          <w:sz w:val="22"/>
-        </w:rPr>
-        <w:t xml:space="preserve">-Administered core infrastructure including Active Directory (AD), domain controllers (DCs), print servers, and server room hardware; ensured uptime and coordinated with external teams during outages. </w:t>
-      </w:r>
-    </w:p>
-    <w:p>
-      <w:pPr>
-        <w:spacing w:after="0"/>
-      </w:pPr>
-      <w:r>
-        <w:rPr>
-          <w:rFonts w:ascii="Times" w:hAnsi="Times" w:cs="Times"/>
-          <w:sz w:val="22"/>
-        </w:rPr>
-        <w:t xml:space="preserve">-Managed Microsoft 365 licensing, user account provisioning, password lifecycle, access levels, and email setup for all school staff. </w:t>
-      </w:r>
-    </w:p>
-    <w:p>
-      <w:pPr>
-        <w:spacing w:after="0"/>
-      </w:pPr>
-      <w:r>
-        <w:rPr>
-          <w:rFonts w:ascii="Times" w:hAnsi="Times" w:cs="Times"/>
-          <w:sz w:val="22"/>
-        </w:rPr>
-        <w:t xml:space="preserve">-Oversaw computer laboratories, ensuring devices were patched, secured, and optimized for instructional use. -Maintained Excel-based asset inventory for all technology equipment, tracking lifecycle status and usage across the school. </w:t>
-      </w:r>
-    </w:p>
-    <w:p>
-      <w:pPr>
-        <w:spacing w:after="0"/>
-      </w:pPr>
-      <w:r>
-        <w:rPr>
-          <w:rFonts w:ascii="Times" w:hAnsi="Times" w:cs="Times"/>
-          <w:sz w:val="22"/>
-        </w:rPr>
-        <w:t xml:space="preserve">-Delivered Tier 1–2 technical support for staff and students, resolving hardware/software issues and maintaining operational continuity. </w:t>
-      </w:r>
-    </w:p>
-    <w:p>
-      <w:pPr>
-        <w:spacing w:after="0"/>
-        <w:rPr>
-          <w:rFonts w:ascii="Times" w:hAnsi="Times" w:cs="Times"/>
-          <w:sz w:val="22"/>
-        </w:rPr>
-      </w:pPr>
-      <w:r>
-        <w:rPr>
-          <w:rFonts w:ascii="Times" w:hAnsi="Times" w:cs="Times"/>
-          <w:sz w:val="22"/>
-        </w:rPr>
-        <w:t>-Provisioned and configured new devices to meet district standards, ensuring compliance, security, and instructional readiness.</w:t>
-      </w:r>
-    </w:p>
-    <w:p>
-      <w:pPr>
-        <w:spacing w:after="0"/>
         <w:rPr>
           <w:rFonts w:ascii="Times" w:hAnsi="Times" w:cs="Times"/>
           <w:sz w:val="22"/>
@@ -1003,147 +1169,68 @@
     <w:p>
       <w:pPr>
         <w:spacing w:after="0"/>
-        <w:rPr>
-          <w:rFonts w:ascii="Times" w:hAnsi="Times" w:cs="Times"/>
-          <w:sz w:val="22"/>
-        </w:rPr>
-      </w:pPr>
-      <w:r>
-        <w:rPr>
-          <w:rFonts w:ascii="Times" w:hAnsi="Times" w:cs="Times"/>
-          <w:sz w:val="22"/>
-        </w:rPr>
-        <w:t>Microsoft Certified: Identity and Access Administrator Associate (SC-300), Endpoint Administrator Associate (MD-102), Security, Compliance, Identity Fundamentals (SC-900), Power Platform Fundamentals (PL-900)</w:t>
-      </w:r>
-    </w:p>
-    <w:p>
-      <w:pPr>
-        <w:spacing w:after="0"/>
-      </w:pPr>
-    </w:p>
-    <w:p>
-      <w:pPr>
-        <w:spacing w:after="0"/>
-        <w:rPr>
-          <w:rFonts w:ascii="Times" w:hAnsi="Times" w:cs="Times"/>
-          <w:sz w:val="22"/>
-        </w:rPr>
-      </w:pPr>
-      <w:r>
-        <w:rPr>
-          <w:rFonts w:ascii="Times" w:hAnsi="Times" w:cs="Times"/>
-          <w:sz w:val="22"/>
-        </w:rPr>
-        <w:t xml:space="preserve">Pursuing: </w:t>
-      </w:r>
-    </w:p>
-    <w:p>
-      <w:pPr>
-        <w:spacing w:after="0"/>
-        <w:rPr>
-          <w:rFonts w:ascii="Times" w:hAnsi="Times" w:cs="Times"/>
-          <w:sz w:val="22"/>
-        </w:rPr>
-      </w:pPr>
-      <w:r>
-        <w:rPr>
-          <w:rFonts w:ascii="Times" w:hAnsi="Times" w:cs="Times"/>
-          <w:sz w:val="22"/>
-        </w:rPr>
-        <w:t xml:space="preserve">CompTIA Security+ </w:t>
-      </w:r>
-      <w:r>
-        <w:rPr>
-          <w:rFonts w:ascii="Times" w:hAnsi="Times" w:cs="Times"/>
-          <w:sz w:val="22"/>
-        </w:rPr>
-        <w:t>due Beginning of 2026</w:t>
-      </w:r>
-    </w:p>
-    <w:p>
-      <w:pPr>
-        <w:spacing w:after="0"/>
-        <w:rPr>
-          <w:rFonts w:ascii="Times" w:hAnsi="Times" w:cs="Times"/>
-          <w:sz w:val="22"/>
-        </w:rPr>
-      </w:pPr>
-      <w:r>
-        <w:rPr>
-          <w:rFonts w:ascii="Times" w:hAnsi="Times" w:cs="Times"/>
-          <w:sz w:val="22"/>
-        </w:rPr>
-        <w:t>Information Protection Administrator Associate (SC-40</w:t>
-      </w:r>
-      <w:r>
-        <w:rPr>
-          <w:rFonts w:ascii="Times" w:hAnsi="Times" w:cs="Times"/>
-          <w:sz w:val="22"/>
-        </w:rPr>
-        <w:t>1</w:t>
-      </w:r>
-      <w:r>
-        <w:rPr>
-          <w:rFonts w:ascii="Times" w:hAnsi="Times" w:cs="Times"/>
-          <w:sz w:val="22"/>
-        </w:rPr>
-        <w:t>)</w:t>
-      </w:r>
-      <w:r>
-        <w:rPr>
-          <w:rFonts w:ascii="Times" w:hAnsi="Times" w:cs="Times"/>
-          <w:sz w:val="22"/>
-        </w:rPr>
-        <w:t xml:space="preserve"> due November 9</w:t>
-      </w:r>
-      <w:r>
-        <w:rPr>
-          <w:rFonts w:ascii="Times" w:hAnsi="Times" w:cs="Times"/>
-          <w:sz w:val="22"/>
-          <w:vertAlign w:val="superscript"/>
-        </w:rPr>
-        <w:t>th</w:t>
-      </w:r>
-      <w:proofErr w:type="gramStart"/>
-      <w:r>
-        <w:rPr>
-          <w:rFonts w:ascii="Times" w:hAnsi="Times" w:cs="Times"/>
-          <w:sz w:val="22"/>
-        </w:rPr>
-        <w:t xml:space="preserve"> 2025</w:t>
-      </w:r>
-      <w:proofErr w:type="gramEnd"/>
-    </w:p>
-    <w:p>
-      <w:pPr>
-        <w:spacing w:after="0"/>
-        <w:rPr>
-          <w:rFonts w:ascii="Times" w:hAnsi="Times" w:cs="Times"/>
-          <w:sz w:val="22"/>
-        </w:rPr>
-      </w:pPr>
-      <w:r>
-        <w:rPr>
-          <w:rFonts w:ascii="Times" w:hAnsi="Times" w:cs="Times"/>
-          <w:sz w:val="22"/>
-        </w:rPr>
-        <w:t>Security Operations Analyst Associate (SC-200) due end of November 2025</w:t>
-      </w:r>
-    </w:p>
-    <w:p>
-      <w:pPr>
-        <w:spacing w:after="0"/>
-        <w:rPr>
-          <w:rFonts w:ascii="Times" w:hAnsi="Times" w:cs="Times"/>
-          <w:sz w:val="22"/>
-        </w:rPr>
-      </w:pPr>
-      <w:r>
-        <w:rPr>
-          <w:rFonts w:ascii="Times" w:hAnsi="Times" w:cs="Times"/>
-          <w:sz w:val="22"/>
-        </w:rPr>
-        <w:t>Microsoft Cybersecurity Architect (SC-100) due end of December 2025</w:t>
+      </w:pPr>
+      <w:r>
+        <w:rPr>
+          <w:rFonts w:ascii="Times" w:hAnsi="Times" w:cs="Times"/>
+          <w:sz w:val="22"/>
+        </w:rPr>
+        <w:t>Microsoft Certified: Microsoft 365 Administrator Expert (MS-102), Identity and Access Administrator Associate (SC-300), Security Operations Analyst Associate (SC-200), Information Protection Administrator (SC-401), Endpoint Administrator Associate (MD-102), Azure Administrator Associate (AZ-104), AI Transformation Leader (AB-731), AI Business Professional (AB-730), AI Agent Builder Associate (AB-620), Security, Compliance, and Identity Fundamentals (SC-900), Azure Fundamentals (AZ-900), Azure AI Fundamental</w:t>
+      </w:r>
+      <w:r>
+        <w:rPr>
+          <w:rFonts w:ascii="Times" w:hAnsi="Times" w:cs="Times"/>
+          <w:sz w:val="22"/>
+        </w:rPr>
+        <w:t>s (AI-901), Power Platform Fundamentals (PL-900), Copilot and Agent Administration Fundamentals (AB-900)</w:t>
+      </w:r>
+    </w:p>
+    <w:p>
+      <w:pPr>
+        <w:spacing w:after="0"/>
+      </w:pPr>
+      <w:r>
+        <w:rPr>
+          <w:rFonts w:ascii="Times" w:hAnsi="Times" w:cs="Times"/>
+          <w:sz w:val="22"/>
+        </w:rPr>
+        <w:t>Microsoft Applied Skills: Create Agents in Microsoft Copilot Studio; Generate Reports with AI Research Agents</w:t>
+      </w:r>
+    </w:p>
+    <w:p>
+      <w:pPr>
+        <w:spacing w:after="0"/>
+      </w:pPr>
+      <w:r>
+        <w:rPr>
+          <w:rFonts w:ascii="Times" w:hAnsi="Times" w:cs="Times"/>
+          <w:sz w:val="22"/>
+        </w:rPr>
+        <w:t xml:space="preserve"> </w:t>
+      </w:r>
+    </w:p>
+    <w:p>
+      <w:pPr>
+        <w:spacing w:after="0"/>
+      </w:pPr>
+      <w:r>
+        <w:rPr>
+          <w:rFonts w:ascii="Times" w:hAnsi="Times" w:cs="Times"/>
+          <w:sz w:val="22"/>
+        </w:rPr>
+        <w:t>Pursuing:</w:t>
+      </w:r>
+    </w:p>
+    <w:p>
+      <w:pPr>
+        <w:spacing w:after="0"/>
+      </w:pPr>
+      <w:r>
+        <w:rPr>
+          <w:rFonts w:ascii="Times" w:hAnsi="Times" w:cs="Times"/>
+          <w:sz w:val="22"/>
+        </w:rPr>
+        <w:t>Microsoft Cybersecurity Architect Expert (SC-100), Azure Solutions Architect Expert (AZ-305), Cloud and AI Security Engineer Associate (SC-500), Azure AI Apps and Agents Developer Associate (AI-103), Azure Network Engineer Associate (AZ-700), GitHub Advanced Security (GH-500), GitHub Actions (GH-200), CompTIA Security+</w:t>
       </w:r>
     </w:p>
     <w:p/>
@@ -1598,7 +1685,6 @@
   <w:style w:type="character" w:default="1" w:styleId="DefaultParagraphFont">
     <w:name w:val="Default Paragraph Font"/>
     <w:uiPriority w:val="1"/>
-    <w:semiHidden/>
     <w:unhideWhenUsed/>
   </w:style>
   <w:style w:type="table" w:default="1" w:styleId="TableNormal">
@@ -1885,4 +1971,10 @@
     <ds:schemaRef ds:uri="http://schemas.apple.com/cocoa/2006/metadata"/>
   </ds:schemaRefs>
 </ds:datastoreItem>
+</file>
+
+<file path=docMetadata/LabelInfo.xml><?xml version="1.0" encoding="utf-8"?>
+<clbl:labelList xmlns:clbl="http://schemas.microsoft.com/office/2020/mipLabelMetadata">
+  <clbl:label id="{defa4170-0d19-0005-0000-bc88714345d2}" enabled="1" method="Privileged" siteId="{882eee00-e2f2-45d4-83ec-f8c22d82bfc4}" contentBits="0" removed="0"/>
+</clbl:labelList>
 </file>
</xml_diff>

<commit_message>
Add link to full Microsoft transcript on certifications section
</commit_message>
<xml_diff>
--- a/UbelioFernandezTabetResume.docx
+++ b/UbelioFernandezTabetResume.docx
@@ -1175,26 +1175,36 @@
           <w:rFonts w:ascii="Times" w:hAnsi="Times" w:cs="Times"/>
           <w:sz w:val="22"/>
         </w:rPr>
-        <w:t>Microsoft Certified: Microsoft 365 Administrator Expert (MS-102), Identity and Access Administrator Associate (SC-300), Security Operations Analyst Associate (SC-200), Information Protection Administrator (SC-401), Endpoint Administrator Associate (MD-102), Azure Administrator Associate (AZ-104), AI Transformation Leader (AB-731), AI Business Professional (AB-730), AI Agent Builder Associate (AB-620), Security, Compliance, and Identity Fundamentals (SC-900), Azure Fundamentals (AZ-900), Azure AI Fundamental</w:t>
-      </w:r>
-      <w:r>
-        <w:rPr>
-          <w:rFonts w:ascii="Times" w:hAnsi="Times" w:cs="Times"/>
-          <w:sz w:val="22"/>
-        </w:rPr>
-        <w:t>s (AI-901), Power Platform Fundamentals (PL-900), Copilot and Agent Administration Fundamentals (AB-900)</w:t>
-      </w:r>
-    </w:p>
-    <w:p>
-      <w:pPr>
-        <w:spacing w:after="0"/>
-      </w:pPr>
-      <w:r>
-        <w:rPr>
-          <w:rFonts w:ascii="Times" w:hAnsi="Times" w:cs="Times"/>
-          <w:sz w:val="22"/>
-        </w:rPr>
-        <w:t>Microsoft Applied Skills: Create Agents in Microsoft Copilot Studio; Generate Reports with AI Research Agents</w:t>
+        <w:t>Microsoft Certified: Microsoft 365 Administrator Expert (MS-102), Identity and Access Administrator Associate (SC-300), Security Operations Analyst Associate (SC-200), Information Protection Administrator (SC-401), Endpoint Administrator Associate (MD-102), Azure Administrator Associate (AZ-104), AI Transformation Leader (AB-731), AI Business Professional (AB-730), AI Agent Builder Associate (AB-620), Security, Compliance, and Identity Fundamentals (SC-900), Azure Fundamentals (AZ-900), Azure AI Fundamentals (AI-901), Power Platform Fundamentals (PL-900), Copilot and Agent Administration Fundamentals (AB-900)</w:t>
+      </w:r>
+    </w:p>
+    <w:p>
+      <w:pPr>
+        <w:spacing w:after="0"/>
+        <w:rPr>
+          <w:rFonts w:ascii="Times" w:hAnsi="Times" w:cs="Times"/>
+          <w:sz w:val="22"/>
+          <w:szCs w:val="22"/>
+        </w:rPr>
+      </w:pPr>
+      <w:hyperlink r:id="rId6" w:tgtFrame="_blank" w:history="1">
+        <w:r>
+          <w:rPr>
+            <w:rStyle w:val="Hyperlink"/>
+            <w:rFonts w:ascii="Times" w:hAnsi="Times" w:cs="Times"/>
+            <w:sz w:val="22"/>
+            <w:szCs w:val="22"/>
+          </w:rPr>
+          <w:t>See Complete Microsoft Transcript</w:t>
+        </w:r>
+      </w:hyperlink>
+      <w:r>
+        <w:rPr>
+          <w:rFonts w:ascii="Times" w:hAnsi="Times" w:cs="Times"/>
+          <w:sz w:val="22"/>
+          <w:szCs w:val="22"/>
+        </w:rPr>
+        <w:t> for all Microsoft Certifications, Applied Skills and other Microsoft related Learning.</w:t>
       </w:r>
     </w:p>
     <w:p>

</xml_diff>